<commit_message>
style: replicate exact cover page layout and styling from reference report
</commit_message>
<xml_diff>
--- a/docs/Aditya_Kumar_Internship_Report.docx
+++ b/docs/Aditya_Kumar_Internship_Report.docx
@@ -2,37 +2,6 @@
 <file path=word/document.xml><?xml version="1.0" encoding="utf-8"?>
 <w:document xmlns:wpc="http://schemas.microsoft.com/office/word/2010/wordprocessingCanvas" xmlns:mo="http://schemas.microsoft.com/office/mac/office/2008/main" xmlns:mc="http://schemas.openxmlformats.org/markup-compatibility/2006" xmlns:mv="urn:schemas-microsoft-com:mac:vml" xmlns:o="urn:schemas-microsoft-com:office:office" xmlns:r="http://schemas.openxmlformats.org/officeDocument/2006/relationships" xmlns:m="http://schemas.openxmlformats.org/officeDocument/2006/math" xmlns:v="urn:schemas-microsoft-com:vml" xmlns:wp14="http://schemas.microsoft.com/office/word/2010/wordprocessingDrawing" xmlns:wp="http://schemas.openxmlformats.org/drawingml/2006/wordprocessingDrawing" xmlns:w10="urn:schemas-microsoft-com:office:word" xmlns:w="http://schemas.openxmlformats.org/wordprocessingml/2006/main" xmlns:w14="http://schemas.microsoft.com/office/word/2010/wordml" xmlns:wpg="http://schemas.microsoft.com/office/word/2010/wordprocessingGroup" xmlns:wpi="http://schemas.microsoft.com/office/word/2010/wordprocessingInk" xmlns:wne="http://schemas.microsoft.com/office/word/2006/wordml" xmlns:wps="http://schemas.microsoft.com/office/word/2010/wordprocessingShape" mc:Ignorable="w14 wp14">
   <w:body>
-    <w:p>
-      <w:pPr>
-        <w:spacing w:after="40"/>
-        <w:jc w:val="center"/>
-      </w:pPr>
-      <w:r>
-        <w:rPr>
-          <w:rFonts w:ascii="Calibri" w:hAnsi="Calibri"/>
-          <w:b/>
-          <w:color w:val="102C57"/>
-          <w:sz w:val="38"/>
-        </w:rPr>
-        <w:t>HARIDWAR UNIVERSITY, ROORKEE</w:t>
-      </w:r>
-    </w:p>
-    <w:p>
-      <w:pPr>
-        <w:spacing w:after="280"/>
-        <w:jc w:val="center"/>
-      </w:pPr>
-      <w:r>
-        <w:rPr>
-          <w:rFonts w:ascii="Calibri" w:hAnsi="Calibri"/>
-          <w:color w:val="35598E"/>
-          <w:sz w:val="22"/>
-        </w:rPr>
-        <w:t>DEPARTMENT OF COMPUTER SCIENCE &amp; ENGINEERING</w:t>
-        <w:br/>
-        <w:t>Bachelor of Technology (Computer Science &amp; Engineering)</w:t>
-      </w:r>
-    </w:p>
     <w:tbl>
       <w:tblPr>
         <w:tblW w:type="auto" w:w="0"/>
@@ -46,41 +15,36 @@
         <w:tc>
           <w:tcPr>
             <w:tcW w:type="dxa" w:w="9360"/>
-            <w:shd w:fill="EEF2F6"/>
+            <w:shd w:fill="003366"/>
             <w:tcMar>
               <w:top w:w="140" w:type="dxa"/>
               <w:bottom w:w="140" w:type="dxa"/>
               <w:left w:w="180" w:type="dxa"/>
               <w:right w:w="180" w:type="dxa"/>
             </w:tcMar>
-            <w:tcBorders>
-              <w:left w:val="single" w:sz="24" w:space="0" w:color="102C57"/>
-              <w:top w:val="none"/>
-              <w:bottom w:val="none"/>
-              <w:right w:val="none"/>
-            </w:tcBorders>
           </w:tcPr>
           <w:p>
             <w:pPr>
               <w:spacing w:after="0" w:line="276" w:lineRule="auto"/>
+              <w:jc w:val="center"/>
             </w:pPr>
             <w:r>
               <w:rPr>
                 <w:rFonts w:ascii="Calibri" w:hAnsi="Calibri"/>
                 <w:b/>
-                <w:color w:val="102C57"/>
-                <w:sz w:val="21"/>
+                <w:color w:val="FFFFFF"/>
+                <w:sz w:val="36"/>
               </w:rPr>
-              <w:t>ACADEMIC INTERNSHIP REPORT (SESSION 2025–2026)</w:t>
+              <w:t xml:space="preserve">HARIDWAR UNIVERSITY </w:t>
               <w:br/>
             </w:r>
             <w:r>
               <w:rPr>
                 <w:rFonts w:ascii="Calibri" w:hAnsi="Calibri"/>
-                <w:color w:val="1E293B"/>
-                <w:sz w:val="20"/>
+                <w:color w:val="FFFFFF"/>
+                <w:sz w:val="18"/>
               </w:rPr>
-              <w:t>B.Tech. 5th Semester Summer Internship Training Report submitted in partial fulfilment of the requirements for the degree of Bachelor of Technology in Computer Science &amp; Engineering.</w:t>
+              <w:t>Roorkee, Uttarakhand – 247667</w:t>
             </w:r>
           </w:p>
         </w:tc>
@@ -88,45 +52,25 @@
     </w:tbl>
     <w:p>
       <w:pPr>
-        <w:spacing w:after="120"/>
-      </w:pPr>
-    </w:p>
-    <w:p>
-      <w:pPr>
-        <w:spacing w:before="320" w:after="80"/>
+        <w:spacing w:before="280" w:after="200" w:line="276" w:lineRule="auto"/>
         <w:jc w:val="center"/>
       </w:pPr>
       <w:r>
         <w:rPr>
           <w:rFonts w:ascii="Calibri" w:hAnsi="Calibri"/>
           <w:b/>
-          <w:color w:val="64748B"/>
+          <w:color w:val="000000"/>
           <w:sz w:val="22"/>
         </w:rPr>
-        <w:t>INTERNSHIP PROJECT TITLE:</w:t>
-        <w:br/>
+        <w:t xml:space="preserve">Department of Computer Science &amp; Engineering </w:t>
       </w:r>
       <w:r>
         <w:rPr>
           <w:rFonts w:ascii="Calibri" w:hAnsi="Calibri"/>
-          <w:b/>
-          <w:color w:val="102C57"/>
-          <w:sz w:val="30"/>
-        </w:rPr>
-        <w:t>Basic Analysis of RAG Systems &amp; Development of a Personal Document Q&amp;A Assistant (RAG Pipeline)</w:t>
-      </w:r>
-    </w:p>
-    <w:p>
-      <w:pPr>
-        <w:spacing w:before="280" w:after="120"/>
-      </w:pPr>
-      <w:r>
-        <w:rPr>
-          <w:b/>
-          <w:color w:val="102C57"/>
+          <w:color w:val="000000"/>
           <w:sz w:val="22"/>
         </w:rPr>
-        <w:t>Candidate &amp; Host Organisation Profile:</w:t>
+        <w:t>Bachelor of Technology</w:t>
       </w:r>
     </w:p>
     <w:tbl>
@@ -135,11 +79,91 @@
         <w:jc w:val="center"/>
         <w:tblLook w:firstColumn="1" w:firstRow="1" w:lastColumn="0" w:lastRow="0" w:noHBand="0" w:noVBand="1" w:val="04A0"/>
         <w:tblBorders>
-          <w:top w:val="single" w:sz="4" w:space="0" w:color="CBD5E1"/>
+          <w:top w:val="single" w:sz="4" w:space="0" w:color="D1D5DB"/>
           <w:left w:val="none"/>
-          <w:bottom w:val="single" w:sz="4" w:space="0" w:color="CBD5E1"/>
+          <w:bottom w:val="single" w:sz="4" w:space="0" w:color="D1D5DB"/>
           <w:right w:val="none"/>
-          <w:insideH w:val="single" w:sz="4" w:space="0" w:color="CBD5E1"/>
+          <w:insideH w:val="single" w:sz="4" w:space="0" w:color="D1D5DB"/>
+          <w:insideV w:val="none"/>
+        </w:tblBorders>
+      </w:tblPr>
+      <w:tblGrid>
+        <w:gridCol w:w="9360"/>
+      </w:tblGrid>
+      <w:tr>
+        <w:tc>
+          <w:tcPr>
+            <w:tcW w:type="dxa" w:w="8640"/>
+            <w:shd w:fill="FFF8EF"/>
+            <w:tcMar>
+              <w:top w:w="140" w:type="dxa"/>
+              <w:bottom w:w="140" w:type="dxa"/>
+              <w:left w:w="180" w:type="dxa"/>
+              <w:right w:w="180" w:type="dxa"/>
+            </w:tcMar>
+          </w:tcPr>
+          <w:p>
+            <w:pPr>
+              <w:spacing w:after="0" w:line="276" w:lineRule="auto"/>
+              <w:jc w:val="center"/>
+            </w:pPr>
+            <w:r>
+              <w:rPr>
+                <w:rFonts w:ascii="Calibri" w:hAnsi="Calibri"/>
+                <w:b/>
+                <w:color w:val="000000"/>
+                <w:sz w:val="31"/>
+              </w:rPr>
+              <w:t xml:space="preserve">INTERNSHIP TRAINING REPORT </w:t>
+            </w:r>
+            <w:r>
+              <w:rPr>
+                <w:rFonts w:ascii="Calibri" w:hAnsi="Calibri"/>
+                <w:color w:val="000000"/>
+                <w:sz w:val="20"/>
+              </w:rPr>
+              <w:t xml:space="preserve">(Summer Internship – 2026) </w:t>
+              <w:br/>
+            </w:r>
+            <w:r>
+              <w:rPr>
+                <w:rFonts w:ascii="Calibri" w:hAnsi="Calibri"/>
+                <w:b/>
+                <w:color w:val="000000"/>
+                <w:sz w:val="20"/>
+              </w:rPr>
+              <w:t>Project: Basic Analysis of RAG Systems &amp; Development of a Personal Document Q&amp;A Assistant</w:t>
+            </w:r>
+          </w:p>
+        </w:tc>
+      </w:tr>
+    </w:tbl>
+    <w:p>
+      <w:pPr>
+        <w:spacing w:before="280" w:after="80"/>
+        <w:jc w:val="center"/>
+      </w:pPr>
+      <w:r>
+        <w:rPr>
+          <w:rFonts w:ascii="Calibri" w:hAnsi="Calibri"/>
+          <w:b/>
+          <w:color w:val="000000"/>
+          <w:sz w:val="22"/>
+        </w:rPr>
+        <w:t>Submitted By</w:t>
+      </w:r>
+    </w:p>
+    <w:tbl>
+      <w:tblPr>
+        <w:tblW w:type="auto" w:w="0"/>
+        <w:jc w:val="center"/>
+        <w:tblLook w:firstColumn="1" w:firstRow="1" w:lastColumn="0" w:lastRow="0" w:noHBand="0" w:noVBand="1" w:val="04A0"/>
+        <w:tblBorders>
+          <w:top w:val="single" w:sz="4" w:space="0" w:color="B0C4DE"/>
+          <w:left w:val="none"/>
+          <w:bottom w:val="single" w:sz="4" w:space="0" w:color="B0C4DE"/>
+          <w:right w:val="none"/>
+          <w:insideH w:val="single" w:sz="4" w:space="0" w:color="B0C4DE"/>
           <w:insideV w:val="none"/>
         </w:tblBorders>
       </w:tblPr>
@@ -148,62 +172,53 @@
         <w:gridCol w:w="4680"/>
       </w:tblGrid>
       <w:tr>
-        <w:trPr>
-          <w:tblHeader/>
-        </w:trPr>
         <w:tc>
           <w:tcPr>
-            <w:tcW w:type="dxa" w:w="4680"/>
-            <w:shd w:fill="102C57"/>
+            <w:tcW w:type="dxa" w:w="3168"/>
+            <w:shd w:fill="D5E3EF"/>
             <w:tcMar>
-              <w:top w:w="120" w:type="dxa"/>
-              <w:bottom w:w="120" w:type="dxa"/>
-              <w:left w:w="140" w:type="dxa"/>
-              <w:right w:w="140" w:type="dxa"/>
+              <w:top w:w="60" w:type="dxa"/>
+              <w:bottom w:w="60" w:type="dxa"/>
+              <w:left w:w="120" w:type="dxa"/>
+              <w:right w:w="120" w:type="dxa"/>
             </w:tcMar>
-            <w:vAlign w:val="center"/>
           </w:tcPr>
           <w:p>
             <w:pPr>
               <w:spacing w:after="0"/>
-              <w:jc w:val="left"/>
             </w:pPr>
             <w:r>
               <w:rPr>
                 <w:rFonts w:ascii="Calibri" w:hAnsi="Calibri"/>
                 <w:b/>
-                <w:color w:val="FFFFFF"/>
+                <w:color w:val="000000"/>
                 <w:sz w:val="20"/>
               </w:rPr>
-              <w:t>Student Credentials</w:t>
+              <w:t>Student Name</w:t>
             </w:r>
           </w:p>
         </w:tc>
         <w:tc>
           <w:tcPr>
-            <w:tcW w:type="dxa" w:w="4680"/>
-            <w:shd w:fill="102C57"/>
+            <w:tcW w:type="dxa" w:w="5472"/>
             <w:tcMar>
-              <w:top w:w="120" w:type="dxa"/>
-              <w:bottom w:w="120" w:type="dxa"/>
-              <w:left w:w="140" w:type="dxa"/>
-              <w:right w:w="140" w:type="dxa"/>
+              <w:top w:w="60" w:type="dxa"/>
+              <w:bottom w:w="60" w:type="dxa"/>
+              <w:left w:w="120" w:type="dxa"/>
+              <w:right w:w="120" w:type="dxa"/>
             </w:tcMar>
-            <w:vAlign w:val="center"/>
           </w:tcPr>
           <w:p>
             <w:pPr>
               <w:spacing w:after="0"/>
-              <w:jc w:val="left"/>
             </w:pPr>
             <w:r>
               <w:rPr>
                 <w:rFonts w:ascii="Calibri" w:hAnsi="Calibri"/>
-                <w:b/>
-                <w:color w:val="FFFFFF"/>
+                <w:color w:val="000000"/>
                 <w:sz w:val="20"/>
               </w:rPr>
-              <w:t>Host Organisation Credentials</w:t>
+              <w:t>Aditya Kumar</w:t>
             </w:r>
           </w:p>
         </w:tc>
@@ -211,51 +226,51 @@
       <w:tr>
         <w:tc>
           <w:tcPr>
-            <w:tcW w:type="dxa" w:w="4680"/>
+            <w:tcW w:type="dxa" w:w="3168"/>
+            <w:shd w:fill="D5E3EF"/>
             <w:tcMar>
-              <w:top w:w="100" w:type="dxa"/>
-              <w:bottom w:w="100" w:type="dxa"/>
-              <w:left w:w="140" w:type="dxa"/>
-              <w:right w:w="140" w:type="dxa"/>
+              <w:top w:w="60" w:type="dxa"/>
+              <w:bottom w:w="60" w:type="dxa"/>
+              <w:left w:w="120" w:type="dxa"/>
+              <w:right w:w="120" w:type="dxa"/>
             </w:tcMar>
-            <w:vAlign w:val="center"/>
           </w:tcPr>
           <w:p>
             <w:pPr>
-              <w:spacing w:after="0" w:line="276" w:lineRule="auto"/>
+              <w:spacing w:after="0"/>
             </w:pPr>
             <w:r>
               <w:rPr>
                 <w:rFonts w:ascii="Calibri" w:hAnsi="Calibri"/>
-                <w:color w:val="1E293B"/>
-                <w:sz w:val="19"/>
+                <w:b/>
+                <w:color w:val="000000"/>
+                <w:sz w:val="20"/>
               </w:rPr>
-              <w:t>Name: Aditya Kumar</w:t>
+              <w:t>Enrolment No.</w:t>
             </w:r>
           </w:p>
         </w:tc>
         <w:tc>
           <w:tcPr>
-            <w:tcW w:type="dxa" w:w="4680"/>
+            <w:tcW w:type="dxa" w:w="5472"/>
             <w:tcMar>
-              <w:top w:w="100" w:type="dxa"/>
-              <w:bottom w:w="100" w:type="dxa"/>
-              <w:left w:w="140" w:type="dxa"/>
-              <w:right w:w="140" w:type="dxa"/>
+              <w:top w:w="60" w:type="dxa"/>
+              <w:bottom w:w="60" w:type="dxa"/>
+              <w:left w:w="120" w:type="dxa"/>
+              <w:right w:w="120" w:type="dxa"/>
             </w:tcMar>
-            <w:vAlign w:val="center"/>
           </w:tcPr>
           <w:p>
             <w:pPr>
-              <w:spacing w:after="0" w:line="276" w:lineRule="auto"/>
+              <w:spacing w:after="0"/>
             </w:pPr>
             <w:r>
               <w:rPr>
                 <w:rFonts w:ascii="Calibri" w:hAnsi="Calibri"/>
-                <w:color w:val="1E293B"/>
-                <w:sz w:val="19"/>
+                <w:color w:val="000000"/>
+                <w:sz w:val="20"/>
               </w:rPr>
-              <w:t>Organisation: InternCourse (interncourse.online)</w:t>
+              <w:t>024101010012</w:t>
             </w:r>
           </w:p>
         </w:tc>
@@ -263,53 +278,51 @@
       <w:tr>
         <w:tc>
           <w:tcPr>
-            <w:tcW w:type="dxa" w:w="4680"/>
-            <w:shd w:fill="F8FAFC"/>
+            <w:tcW w:type="dxa" w:w="3168"/>
+            <w:shd w:fill="D5E3EF"/>
             <w:tcMar>
-              <w:top w:w="100" w:type="dxa"/>
-              <w:bottom w:w="100" w:type="dxa"/>
-              <w:left w:w="140" w:type="dxa"/>
-              <w:right w:w="140" w:type="dxa"/>
+              <w:top w:w="60" w:type="dxa"/>
+              <w:bottom w:w="60" w:type="dxa"/>
+              <w:left w:w="120" w:type="dxa"/>
+              <w:right w:w="120" w:type="dxa"/>
             </w:tcMar>
-            <w:vAlign w:val="center"/>
           </w:tcPr>
           <w:p>
             <w:pPr>
-              <w:spacing w:after="0" w:line="276" w:lineRule="auto"/>
+              <w:spacing w:after="0"/>
             </w:pPr>
             <w:r>
               <w:rPr>
                 <w:rFonts w:ascii="Calibri" w:hAnsi="Calibri"/>
-                <w:color w:val="1E293B"/>
-                <w:sz w:val="19"/>
+                <w:b/>
+                <w:color w:val="000000"/>
+                <w:sz w:val="20"/>
               </w:rPr>
-              <w:t>Roll No: 024101010012</w:t>
+              <w:t>Semester</w:t>
             </w:r>
           </w:p>
         </w:tc>
         <w:tc>
           <w:tcPr>
-            <w:tcW w:type="dxa" w:w="4680"/>
-            <w:shd w:fill="F8FAFC"/>
+            <w:tcW w:type="dxa" w:w="5472"/>
             <w:tcMar>
-              <w:top w:w="100" w:type="dxa"/>
-              <w:bottom w:w="100" w:type="dxa"/>
-              <w:left w:w="140" w:type="dxa"/>
-              <w:right w:w="140" w:type="dxa"/>
+              <w:top w:w="60" w:type="dxa"/>
+              <w:bottom w:w="60" w:type="dxa"/>
+              <w:left w:w="120" w:type="dxa"/>
+              <w:right w:w="120" w:type="dxa"/>
             </w:tcMar>
-            <w:vAlign w:val="center"/>
           </w:tcPr>
           <w:p>
             <w:pPr>
-              <w:spacing w:after="0" w:line="276" w:lineRule="auto"/>
+              <w:spacing w:after="0"/>
             </w:pPr>
             <w:r>
               <w:rPr>
                 <w:rFonts w:ascii="Calibri" w:hAnsi="Calibri"/>
-                <w:color w:val="1E293B"/>
-                <w:sz w:val="19"/>
+                <w:color w:val="000000"/>
+                <w:sz w:val="20"/>
               </w:rPr>
-              <w:t>Registered Location: Patna, Bihar</w:t>
+              <w:t>5th Semester</w:t>
             </w:r>
           </w:p>
         </w:tc>
@@ -317,51 +330,51 @@
       <w:tr>
         <w:tc>
           <w:tcPr>
-            <w:tcW w:type="dxa" w:w="4680"/>
+            <w:tcW w:type="dxa" w:w="3168"/>
+            <w:shd w:fill="D5E3EF"/>
             <w:tcMar>
-              <w:top w:w="100" w:type="dxa"/>
-              <w:bottom w:w="100" w:type="dxa"/>
-              <w:left w:w="140" w:type="dxa"/>
-              <w:right w:w="140" w:type="dxa"/>
+              <w:top w:w="60" w:type="dxa"/>
+              <w:bottom w:w="60" w:type="dxa"/>
+              <w:left w:w="120" w:type="dxa"/>
+              <w:right w:w="120" w:type="dxa"/>
             </w:tcMar>
-            <w:vAlign w:val="center"/>
           </w:tcPr>
           <w:p>
             <w:pPr>
-              <w:spacing w:after="0" w:line="276" w:lineRule="auto"/>
+              <w:spacing w:after="0"/>
             </w:pPr>
             <w:r>
               <w:rPr>
                 <w:rFonts w:ascii="Calibri" w:hAnsi="Calibri"/>
-                <w:color w:val="1E293B"/>
-                <w:sz w:val="19"/>
+                <w:b/>
+                <w:color w:val="000000"/>
+                <w:sz w:val="20"/>
               </w:rPr>
-              <w:t>Enrolment No: 024101010012</w:t>
+              <w:t>Roll No.</w:t>
             </w:r>
           </w:p>
         </w:tc>
         <w:tc>
           <w:tcPr>
-            <w:tcW w:type="dxa" w:w="4680"/>
+            <w:tcW w:type="dxa" w:w="5472"/>
             <w:tcMar>
-              <w:top w:w="100" w:type="dxa"/>
-              <w:bottom w:w="100" w:type="dxa"/>
-              <w:left w:w="140" w:type="dxa"/>
-              <w:right w:w="140" w:type="dxa"/>
+              <w:top w:w="60" w:type="dxa"/>
+              <w:bottom w:w="60" w:type="dxa"/>
+              <w:left w:w="120" w:type="dxa"/>
+              <w:right w:w="120" w:type="dxa"/>
             </w:tcMar>
-            <w:vAlign w:val="center"/>
           </w:tcPr>
           <w:p>
             <w:pPr>
-              <w:spacing w:after="0" w:line="276" w:lineRule="auto"/>
+              <w:spacing w:after="0"/>
             </w:pPr>
             <w:r>
               <w:rPr>
                 <w:rFonts w:ascii="Calibri" w:hAnsi="Calibri"/>
-                <w:color w:val="1E293B"/>
-                <w:sz w:val="19"/>
+                <w:color w:val="000000"/>
+                <w:sz w:val="20"/>
               </w:rPr>
-              <w:t>Managing Director: Ankit Pandey</w:t>
+              <w:t>024101010012</w:t>
             </w:r>
           </w:p>
         </w:tc>
@@ -369,53 +382,137 @@
       <w:tr>
         <w:tc>
           <w:tcPr>
-            <w:tcW w:type="dxa" w:w="4680"/>
-            <w:shd w:fill="F8FAFC"/>
+            <w:tcW w:type="dxa" w:w="3168"/>
+            <w:shd w:fill="D5E3EF"/>
             <w:tcMar>
-              <w:top w:w="100" w:type="dxa"/>
-              <w:bottom w:w="100" w:type="dxa"/>
-              <w:left w:w="140" w:type="dxa"/>
-              <w:right w:w="140" w:type="dxa"/>
+              <w:top w:w="60" w:type="dxa"/>
+              <w:bottom w:w="60" w:type="dxa"/>
+              <w:left w:w="120" w:type="dxa"/>
+              <w:right w:w="120" w:type="dxa"/>
             </w:tcMar>
-            <w:vAlign w:val="center"/>
           </w:tcPr>
           <w:p>
             <w:pPr>
-              <w:spacing w:after="0" w:line="276" w:lineRule="auto"/>
+              <w:spacing w:after="0"/>
             </w:pPr>
             <w:r>
               <w:rPr>
                 <w:rFonts w:ascii="Calibri" w:hAnsi="Calibri"/>
-                <w:color w:val="1E293B"/>
-                <w:sz w:val="19"/>
+                <w:b/>
+                <w:color w:val="000000"/>
+                <w:sz w:val="20"/>
               </w:rPr>
-              <w:t>Semester / Branch: 5th Sem, B.Tech. CSE</w:t>
+              <w:t>Academic Year</w:t>
             </w:r>
           </w:p>
         </w:tc>
         <w:tc>
           <w:tcPr>
-            <w:tcW w:type="dxa" w:w="4680"/>
-            <w:shd w:fill="F8FAFC"/>
+            <w:tcW w:type="dxa" w:w="5472"/>
             <w:tcMar>
-              <w:top w:w="100" w:type="dxa"/>
-              <w:bottom w:w="100" w:type="dxa"/>
-              <w:left w:w="140" w:type="dxa"/>
-              <w:right w:w="140" w:type="dxa"/>
+              <w:top w:w="60" w:type="dxa"/>
+              <w:bottom w:w="60" w:type="dxa"/>
+              <w:left w:w="120" w:type="dxa"/>
+              <w:right w:w="120" w:type="dxa"/>
             </w:tcMar>
-            <w:vAlign w:val="center"/>
           </w:tcPr>
           <w:p>
             <w:pPr>
-              <w:spacing w:after="0" w:line="276" w:lineRule="auto"/>
+              <w:spacing w:after="0"/>
             </w:pPr>
             <w:r>
               <w:rPr>
                 <w:rFonts w:ascii="Calibri" w:hAnsi="Calibri"/>
-                <w:color w:val="1E293B"/>
-                <w:sz w:val="19"/>
+                <w:color w:val="000000"/>
+                <w:sz w:val="20"/>
               </w:rPr>
-              <w:t>Accreditations: ISO 9001:2015, AICTE, MCA Reg.</w:t>
+              <w:t>2025–2026</w:t>
+            </w:r>
+          </w:p>
+        </w:tc>
+      </w:tr>
+    </w:tbl>
+    <w:p>
+      <w:pPr>
+        <w:spacing w:before="240" w:after="80"/>
+        <w:jc w:val="center"/>
+      </w:pPr>
+      <w:r>
+        <w:rPr>
+          <w:rFonts w:ascii="Calibri" w:hAnsi="Calibri"/>
+          <w:b/>
+          <w:color w:val="000000"/>
+          <w:sz w:val="22"/>
+        </w:rPr>
+        <w:t>Internship Organisation Details</w:t>
+      </w:r>
+    </w:p>
+    <w:tbl>
+      <w:tblPr>
+        <w:tblW w:type="auto" w:w="0"/>
+        <w:jc w:val="center"/>
+        <w:tblLook w:firstColumn="1" w:firstRow="1" w:lastColumn="0" w:lastRow="0" w:noHBand="0" w:noVBand="1" w:val="04A0"/>
+        <w:tblBorders>
+          <w:top w:val="single" w:sz="4" w:space="0" w:color="B0C4DE"/>
+          <w:left w:val="none"/>
+          <w:bottom w:val="single" w:sz="4" w:space="0" w:color="B0C4DE"/>
+          <w:right w:val="none"/>
+          <w:insideH w:val="single" w:sz="4" w:space="0" w:color="B0C4DE"/>
+          <w:insideV w:val="none"/>
+        </w:tblBorders>
+      </w:tblPr>
+      <w:tblGrid>
+        <w:gridCol w:w="4680"/>
+        <w:gridCol w:w="4680"/>
+      </w:tblGrid>
+      <w:tr>
+        <w:tc>
+          <w:tcPr>
+            <w:tcW w:type="dxa" w:w="3168"/>
+            <w:shd w:fill="D5E3EF"/>
+            <w:tcMar>
+              <w:top w:w="60" w:type="dxa"/>
+              <w:bottom w:w="60" w:type="dxa"/>
+              <w:left w:w="120" w:type="dxa"/>
+              <w:right w:w="120" w:type="dxa"/>
+            </w:tcMar>
+          </w:tcPr>
+          <w:p>
+            <w:pPr>
+              <w:spacing w:after="0"/>
+            </w:pPr>
+            <w:r>
+              <w:rPr>
+                <w:rFonts w:ascii="Calibri" w:hAnsi="Calibri"/>
+                <w:b/>
+                <w:color w:val="000000"/>
+                <w:sz w:val="20"/>
+              </w:rPr>
+              <w:t>Organisation Name</w:t>
+            </w:r>
+          </w:p>
+        </w:tc>
+        <w:tc>
+          <w:tcPr>
+            <w:tcW w:type="dxa" w:w="5472"/>
+            <w:tcMar>
+              <w:top w:w="60" w:type="dxa"/>
+              <w:bottom w:w="60" w:type="dxa"/>
+              <w:left w:w="120" w:type="dxa"/>
+              <w:right w:w="120" w:type="dxa"/>
+            </w:tcMar>
+          </w:tcPr>
+          <w:p>
+            <w:pPr>
+              <w:spacing w:after="0"/>
+            </w:pPr>
+            <w:r>
+              <w:rPr>
+                <w:rFonts w:ascii="Calibri" w:hAnsi="Calibri"/>
+                <w:color w:val="000000"/>
+                <w:sz w:val="20"/>
+              </w:rPr>
+              <w:t>InternCourse (interncourse.online)</w:t>
             </w:r>
           </w:p>
         </w:tc>
@@ -423,51 +520,51 @@
       <w:tr>
         <w:tc>
           <w:tcPr>
-            <w:tcW w:type="dxa" w:w="4680"/>
+            <w:tcW w:type="dxa" w:w="3168"/>
+            <w:shd w:fill="D5E3EF"/>
             <w:tcMar>
-              <w:top w:w="100" w:type="dxa"/>
-              <w:bottom w:w="100" w:type="dxa"/>
-              <w:left w:w="140" w:type="dxa"/>
-              <w:right w:w="140" w:type="dxa"/>
+              <w:top w:w="60" w:type="dxa"/>
+              <w:bottom w:w="60" w:type="dxa"/>
+              <w:left w:w="120" w:type="dxa"/>
+              <w:right w:w="120" w:type="dxa"/>
             </w:tcMar>
-            <w:vAlign w:val="center"/>
           </w:tcPr>
           <w:p>
             <w:pPr>
-              <w:spacing w:after="0" w:line="276" w:lineRule="auto"/>
+              <w:spacing w:after="0"/>
             </w:pPr>
             <w:r>
               <w:rPr>
                 <w:rFonts w:ascii="Calibri" w:hAnsi="Calibri"/>
-                <w:color w:val="1E293B"/>
-                <w:sz w:val="19"/>
+                <w:b/>
+                <w:color w:val="000000"/>
+                <w:sz w:val="20"/>
               </w:rPr>
-              <w:t>Faculty Mentor: Pooja Parmar</w:t>
+              <w:t>Location</w:t>
             </w:r>
           </w:p>
         </w:tc>
         <w:tc>
           <w:tcPr>
-            <w:tcW w:type="dxa" w:w="4680"/>
+            <w:tcW w:type="dxa" w:w="5472"/>
             <w:tcMar>
-              <w:top w:w="100" w:type="dxa"/>
-              <w:bottom w:w="100" w:type="dxa"/>
-              <w:left w:w="140" w:type="dxa"/>
-              <w:right w:w="140" w:type="dxa"/>
+              <w:top w:w="60" w:type="dxa"/>
+              <w:bottom w:w="60" w:type="dxa"/>
+              <w:left w:w="120" w:type="dxa"/>
+              <w:right w:w="120" w:type="dxa"/>
             </w:tcMar>
-            <w:vAlign w:val="center"/>
           </w:tcPr>
           <w:p>
             <w:pPr>
-              <w:spacing w:after="0" w:line="276" w:lineRule="auto"/>
+              <w:spacing w:after="0"/>
             </w:pPr>
             <w:r>
               <w:rPr>
                 <w:rFonts w:ascii="Calibri" w:hAnsi="Calibri"/>
-                <w:color w:val="1E293B"/>
-                <w:sz w:val="19"/>
+                <w:color w:val="000000"/>
+                <w:sz w:val="20"/>
               </w:rPr>
-              <w:t>Training Domain: Artificial Intelligence &amp; NLP</w:t>
+              <w:t>Patna, Bihar</w:t>
             </w:r>
           </w:p>
         </w:tc>
@@ -475,53 +572,51 @@
       <w:tr>
         <w:tc>
           <w:tcPr>
-            <w:tcW w:type="dxa" w:w="4680"/>
-            <w:shd w:fill="F8FAFC"/>
+            <w:tcW w:type="dxa" w:w="3168"/>
+            <w:shd w:fill="D5E3EF"/>
             <w:tcMar>
-              <w:top w:w="100" w:type="dxa"/>
-              <w:bottom w:w="100" w:type="dxa"/>
-              <w:left w:w="140" w:type="dxa"/>
-              <w:right w:w="140" w:type="dxa"/>
+              <w:top w:w="60" w:type="dxa"/>
+              <w:bottom w:w="60" w:type="dxa"/>
+              <w:left w:w="120" w:type="dxa"/>
+              <w:right w:w="120" w:type="dxa"/>
             </w:tcMar>
-            <w:vAlign w:val="center"/>
           </w:tcPr>
           <w:p>
             <w:pPr>
-              <w:spacing w:after="0" w:line="276" w:lineRule="auto"/>
+              <w:spacing w:after="0"/>
             </w:pPr>
             <w:r>
               <w:rPr>
                 <w:rFonts w:ascii="Calibri" w:hAnsi="Calibri"/>
-                <w:color w:val="1E293B"/>
-                <w:sz w:val="19"/>
+                <w:b/>
+                <w:color w:val="000000"/>
+                <w:sz w:val="20"/>
               </w:rPr>
-              <w:t>Head of Department: Dr. Himanshu Verma</w:t>
+              <w:t>Duration</w:t>
             </w:r>
           </w:p>
         </w:tc>
         <w:tc>
           <w:tcPr>
-            <w:tcW w:type="dxa" w:w="4680"/>
-            <w:shd w:fill="F8FAFC"/>
+            <w:tcW w:type="dxa" w:w="5472"/>
             <w:tcMar>
-              <w:top w:w="100" w:type="dxa"/>
-              <w:bottom w:w="100" w:type="dxa"/>
-              <w:left w:w="140" w:type="dxa"/>
-              <w:right w:w="140" w:type="dxa"/>
+              <w:top w:w="60" w:type="dxa"/>
+              <w:bottom w:w="60" w:type="dxa"/>
+              <w:left w:w="120" w:type="dxa"/>
+              <w:right w:w="120" w:type="dxa"/>
             </w:tcMar>
-            <w:vAlign w:val="center"/>
           </w:tcPr>
           <w:p>
             <w:pPr>
-              <w:spacing w:after="0" w:line="276" w:lineRule="auto"/>
+              <w:spacing w:after="0"/>
             </w:pPr>
             <w:r>
               <w:rPr>
                 <w:rFonts w:ascii="Calibri" w:hAnsi="Calibri"/>
-                <w:color w:val="1E293B"/>
-                <w:sz w:val="19"/>
+                <w:color w:val="000000"/>
+                <w:sz w:val="20"/>
               </w:rPr>
-              <w:t>Certificate ID: IC26/11873 | Duration: 6 Weeks</w:t>
+              <w:t>15 June 2026 to 18 July 2026 (6 Weeks)</w:t>
             </w:r>
           </w:p>
         </w:tc>
@@ -529,51 +624,103 @@
       <w:tr>
         <w:tc>
           <w:tcPr>
-            <w:tcW w:type="dxa" w:w="4680"/>
+            <w:tcW w:type="dxa" w:w="3168"/>
+            <w:shd w:fill="D5E3EF"/>
             <w:tcMar>
-              <w:top w:w="100" w:type="dxa"/>
-              <w:bottom w:w="100" w:type="dxa"/>
-              <w:left w:w="140" w:type="dxa"/>
-              <w:right w:w="140" w:type="dxa"/>
+              <w:top w:w="60" w:type="dxa"/>
+              <w:bottom w:w="60" w:type="dxa"/>
+              <w:left w:w="120" w:type="dxa"/>
+              <w:right w:w="120" w:type="dxa"/>
             </w:tcMar>
-            <w:vAlign w:val="center"/>
           </w:tcPr>
           <w:p>
             <w:pPr>
-              <w:spacing w:after="0" w:line="276" w:lineRule="auto"/>
+              <w:spacing w:after="0"/>
             </w:pPr>
             <w:r>
               <w:rPr>
                 <w:rFonts w:ascii="Calibri" w:hAnsi="Calibri"/>
-                <w:color w:val="1E293B"/>
-                <w:sz w:val="19"/>
+                <w:b/>
+                <w:color w:val="000000"/>
+                <w:sz w:val="20"/>
               </w:rPr>
-              <w:t>GitHub Repository (Code &amp; Pipeline)</w:t>
+              <w:t>Industry Domain</w:t>
             </w:r>
           </w:p>
         </w:tc>
         <w:tc>
           <w:tcPr>
-            <w:tcW w:type="dxa" w:w="4680"/>
+            <w:tcW w:type="dxa" w:w="5472"/>
             <w:tcMar>
-              <w:top w:w="100" w:type="dxa"/>
-              <w:bottom w:w="100" w:type="dxa"/>
-              <w:left w:w="140" w:type="dxa"/>
-              <w:right w:w="140" w:type="dxa"/>
+              <w:top w:w="60" w:type="dxa"/>
+              <w:bottom w:w="60" w:type="dxa"/>
+              <w:left w:w="120" w:type="dxa"/>
+              <w:right w:w="120" w:type="dxa"/>
             </w:tcMar>
-            <w:vAlign w:val="center"/>
           </w:tcPr>
           <w:p>
             <w:pPr>
-              <w:spacing w:after="0" w:line="276" w:lineRule="auto"/>
+              <w:spacing w:after="0"/>
             </w:pPr>
             <w:r>
               <w:rPr>
                 <w:rFonts w:ascii="Calibri" w:hAnsi="Calibri"/>
-                <w:color w:val="1E293B"/>
-                <w:sz w:val="19"/>
+                <w:color w:val="000000"/>
+                <w:sz w:val="20"/>
               </w:rPr>
-              <w:t>https://github.com/aditya93416/personal-document-rag-assistant</w:t>
+              <w:t>Artificial Intelligence &amp; NLP</w:t>
+            </w:r>
+          </w:p>
+        </w:tc>
+      </w:tr>
+      <w:tr>
+        <w:tc>
+          <w:tcPr>
+            <w:tcW w:type="dxa" w:w="3168"/>
+            <w:shd w:fill="D5E3EF"/>
+            <w:tcMar>
+              <w:top w:w="60" w:type="dxa"/>
+              <w:bottom w:w="60" w:type="dxa"/>
+              <w:left w:w="120" w:type="dxa"/>
+              <w:right w:w="120" w:type="dxa"/>
+            </w:tcMar>
+          </w:tcPr>
+          <w:p>
+            <w:pPr>
+              <w:spacing w:after="0"/>
+            </w:pPr>
+            <w:r>
+              <w:rPr>
+                <w:rFonts w:ascii="Calibri" w:hAnsi="Calibri"/>
+                <w:b/>
+                <w:color w:val="000000"/>
+                <w:sz w:val="20"/>
+              </w:rPr>
+              <w:t>Supervisor / Mentor</w:t>
+            </w:r>
+          </w:p>
+        </w:tc>
+        <w:tc>
+          <w:tcPr>
+            <w:tcW w:type="dxa" w:w="5472"/>
+            <w:tcMar>
+              <w:top w:w="60" w:type="dxa"/>
+              <w:bottom w:w="60" w:type="dxa"/>
+              <w:left w:w="120" w:type="dxa"/>
+              <w:right w:w="120" w:type="dxa"/>
+            </w:tcMar>
+          </w:tcPr>
+          <w:p>
+            <w:pPr>
+              <w:spacing w:after="0"/>
+            </w:pPr>
+            <w:r>
+              <w:rPr>
+                <w:rFonts w:ascii="Calibri" w:hAnsi="Calibri"/>
+                <w:color w:val="000000"/>
+                <w:sz w:val="20"/>
+              </w:rPr>
+              <w:t>Ankit Pandey (Managing Director) &amp; Pooja Parmar (Faculty Supervisor)</w:t>
             </w:r>
           </w:p>
         </w:tc>
@@ -581,23 +728,55 @@
     </w:tbl>
     <w:p>
       <w:pPr>
-        <w:spacing w:after="160"/>
-      </w:pPr>
-    </w:p>
-    <w:p>
-      <w:pPr>
-        <w:spacing w:before="200" w:after="0"/>
+        <w:spacing w:before="280" w:after="0" w:line="276" w:lineRule="auto"/>
         <w:jc w:val="center"/>
       </w:pPr>
       <w:r>
         <w:rPr>
           <w:rFonts w:ascii="Calibri" w:hAnsi="Calibri"/>
-          <w:color w:val="64748B"/>
-          <w:sz w:val="19"/>
+          <w:b/>
+          <w:color w:val="000000"/>
+          <w:sz w:val="31"/>
         </w:rPr>
-        <w:t>Training Period: 15 June 2026 – 18 July 2026 | Submission Date: October 2026</w:t>
+        <w:t xml:space="preserve">Submitted To </w:t>
         <w:br/>
-        <w:t>Haridwar University, Roorkee, Uttarakhand – 247667</w:t>
+      </w:r>
+      <w:r>
+        <w:rPr>
+          <w:rFonts w:ascii="Calibri" w:hAnsi="Calibri"/>
+          <w:b/>
+          <w:color w:val="000000"/>
+          <w:sz w:val="22"/>
+        </w:rPr>
+        <w:t xml:space="preserve">Dr. Himanshu Verma </w:t>
+        <w:br/>
+      </w:r>
+      <w:r>
+        <w:rPr>
+          <w:rFonts w:ascii="Calibri" w:hAnsi="Calibri"/>
+          <w:color w:val="000000"/>
+          <w:sz w:val="22"/>
+        </w:rPr>
+        <w:t xml:space="preserve">Head of Department, CSE </w:t>
+        <w:br/>
+        <w:t xml:space="preserve">Department of Computer Science &amp; Engineering </w:t>
+        <w:br/>
+        <w:t xml:space="preserve">Haridwar University, Roorkee </w:t>
+      </w:r>
+    </w:p>
+    <w:p>
+      <w:pPr>
+        <w:spacing w:before="160" w:after="0"/>
+        <w:jc w:val="center"/>
+      </w:pPr>
+      <w:r>
+        <w:rPr>
+          <w:rFonts w:ascii="Calibri" w:hAnsi="Calibri"/>
+          <w:b/>
+          <w:color w:val="000000"/>
+          <w:sz w:val="22"/>
+        </w:rPr>
+        <w:t>Academic Year: 2025 – 2026</w:t>
       </w:r>
     </w:p>
     <w:p>

</xml_diff>